<commit_message>
docs: SRS v1.3 — FR-08 built, menu and pause API built, FR-10 postconditions, one-word reorder
Co-Authored-By: Claude Opus 5.5 <noreply@anthropic.com>
Claude-Session: https://claude.ai/code/session_01DiyQSEwjGq7LWHGap3UdWx
</commit_message>
<xml_diff>
--- a/docs/Sufria_SRS_Chapters_1_2_v1.3.docx
+++ b/docs/Sufria_SRS_Chapters_1_2_v1.3.docx
@@ -392,7 +392,7 @@
                 <w:sz w:val="19"/>
                 <w:szCs w:val="19"/>
               </w:rPr>
-              <w:t xml:space="preserve">9 October 2026</w:t>
+              <w:t xml:space="preserve">10 October 2026</w:t>
             </w:r>
           </w:p>
         </w:tc>
@@ -430,7 +430,7 @@
           <w:sz w:val="21"/>
           <w:szCs w:val="21"/>
         </w:rPr>
-        <w:t xml:space="preserve">This revision brings the specification back in line with the system as built on 9 October 2026, eight weeks after version 1.2, and records what changed around it. Five classes of change were made. </w:t>
+        <w:t xml:space="preserve">This revision brings the specification back in line with the system as built on 10 October 2026, eight weeks after version 1.2, and records what changed around it. Five classes of change were made. </w:t>
       </w:r>
       <w:r>
         <w:rPr>
@@ -496,7 +496,7 @@
           <w:sz w:val="21"/>
           <w:szCs w:val="21"/>
         </w:rPr>
-        <w:t xml:space="preserve">nine requirements were reworded to the system as implemented: a numbered text menu instead of interactive lists, fulfilment chosen before the final summary, the order written at the customer's confirmation and paid in cash, notifications only where they matter to the customer, and dashboard polling every 10 seconds. </w:t>
+        <w:t xml:space="preserve">ten requirements were reworded to the system as implemented: a numbered text menu instead of interactive lists, fulfilment chosen before the final summary, the order written at the customer's confirmation and paid in cash, notifications only where they matter to the customer, dashboard polling every 10 seconds, and the reorder as built — the last accepted order, repeated in one word. </w:t>
       </w:r>
       <w:r>
         <w:rPr>
@@ -1215,7 +1215,7 @@
                 <w:sz w:val="19"/>
                 <w:szCs w:val="19"/>
               </w:rPr>
-              <w:t xml:space="preserve">FR-02, FR-05, FR-06, FR-07, FR-09, FR-10, FR-11, FR-12 and FR-13 reworded to the behaviour as built.</w:t>
+              <w:t xml:space="preserve">FR-02, FR-05, FR-06, FR-07, FR-08, FR-09, FR-10, FR-11, FR-12 and FR-13 reworded to the behaviour as built.</w:t>
             </w:r>
           </w:p>
         </w:tc>
@@ -1239,7 +1239,7 @@
                 <w:sz w:val="19"/>
                 <w:szCs w:val="19"/>
               </w:rPr>
-              <w:t xml:space="preserve">Numbered text menu; fulfilment before the final summary; order written at «‫أكّد‬», cash only; notification policy; 10-second polling.</w:t>
+              <w:t xml:space="preserve">Numbered text menu; fulfilment before the final summary; order written at «‫أكّد‬», cash only; notification policy; 10-second polling; the reorder built on 10 October 2026.</w:t>
             </w:r>
           </w:p>
         </w:tc>
@@ -1369,7 +1369,7 @@
                 <w:sz w:val="19"/>
                 <w:szCs w:val="19"/>
               </w:rPr>
-              <w:t xml:space="preserve">The built cash-order flow added; reorder and online-payment flows marked Planned and Deferred.</w:t>
+              <w:t xml:space="preserve">The built cash-order flow added; the reorder flows rewritten as built; online-payment flows marked Deferred.</w:t>
             </w:r>
           </w:p>
         </w:tc>
@@ -3516,7 +3516,7 @@
           <w:sz w:val="21"/>
           <w:szCs w:val="21"/>
         </w:rPr>
-        <w:t xml:space="preserve">To develop a SaaS platform that enables independent restaurants and small chains to convert their existing repeat customers from aggregator-mediated ordering to direct ordering, by providing a WhatsApp-based ordering experience, a one-tap reorder capability, and a restaurant management dashboard, without relying on per-order commissions.</w:t>
+        <w:t xml:space="preserve">To develop a SaaS platform that enables independent restaurants and small chains to convert their existing repeat customers from aggregator-mediated ordering to direct ordering, by providing a WhatsApp-based ordering experience, a one-word reorder of the last order, and a restaurant management dashboard, without relying on per-order commissions.</w:t>
       </w:r>
     </w:p>
     <w:p>
@@ -3567,7 +3567,7 @@
           <w:sz w:val="21"/>
           <w:szCs w:val="21"/>
         </w:rPr>
-        <w:t xml:space="preserve">Reduce the number of steps required to place a repeat order (one-tap reorder) by at least 70% compared with full menu browsing.</w:t>
+        <w:t xml:space="preserve">Reduce the number of steps required to place a repeat order (the one-word reorder) by at least 70% compared with full menu browsing.</w:t>
       </w:r>
     </w:p>
     <w:p>
@@ -3698,7 +3698,7 @@
           <w:sz w:val="21"/>
           <w:szCs w:val="21"/>
         </w:rPr>
-        <w:t xml:space="preserve">The message-measurement objective is met: the engine counts every outbound message of a conversation, carries the count onto the order (orders.outbound_msg_count), and stores every outbound text (outbound_messages). The data-security objective is met for the built scope: tenants are isolated by row-level security, and no card data is stored because no card is processed. The satisfaction, statistics-accuracy and live-pilot objectives need a pilot, which is not scheduled at this stage (Section 1.4); statistics accuracy also needs FR-14. The reorder-steps, reorder-time and analytics objectives depend on FR-08 (planned) and FR-17 (deferred).</w:t>
+        <w:t xml:space="preserve">The message-measurement objective is met: the engine counts every outbound message of a conversation, carries the count onto the order (orders.outbound_msg_count), and stores every outbound text (outbound_messages). The data-security objective is met for the built scope: tenants are isolated by row-level security, and no card data is stored because no card is processed. The satisfaction, statistics-accuracy and live-pilot objectives need a pilot, which is not scheduled at this stage (Section 1.4); statistics accuracy also needs FR-14. The reorder-steps and reorder-time objectives became measurable when FR-08 was built (10 October 2026) and are not measured yet; the analytics objective depends on FR-17 (deferred).</w:t>
       </w:r>
     </w:p>
     <w:p>
@@ -3838,7 +3838,7 @@
           <w:sz w:val="21"/>
           <w:szCs w:val="21"/>
         </w:rPr>
-        <w:t xml:space="preserve">Self-service menu item management by the restaurant: add, rename, reprice, enable or disable, archive and restore items (in progress — FR-02). Categories are set at onboarding.</w:t>
+        <w:t xml:space="preserve">Self-service menu item management by the restaurant: add, rename, reprice, enable or disable, archive and restore items (API built; dashboard screen in progress — FR-02). Categories are set at onboarding.</w:t>
       </w:r>
     </w:p>
     <w:p>
@@ -3856,7 +3856,7 @@
           <w:sz w:val="21"/>
           <w:szCs w:val="21"/>
         </w:rPr>
-        <w:t xml:space="preserve">WhatsApp-based conversational ordering through a numbered text menu (browsing, cart, summary, confirmation), and one-tap reorder (planned — FR-08).</w:t>
+        <w:t xml:space="preserve">WhatsApp-based conversational ordering through a numbered text menu (browsing, cart, summary, confirmation), and repeating the last order in one word (built — FR-08).</w:t>
       </w:r>
     </w:p>
     <w:p>
@@ -4601,7 +4601,7 @@
                 <w:sz w:val="19"/>
                 <w:szCs w:val="19"/>
               </w:rPr>
-              <w:t xml:space="preserve">In progress. Built and merged: the conversation engine from first message to order (cart, fulfilment, summary, confirmation), opening hours, the session timeout, customer notifications, the dashboard API, restaurant onboarding, and the dashboard's orders and order-details screens. In progress: menu management (backend, then screen). Next: one-tap reorder (FR-08).</w:t>
+              <w:t xml:space="preserve">In progress. Built and merged: the conversation engine from first message to order (cart, fulfilment, summary, confirmation), opening hours, the session timeout, customer notifications, repeating the last order in one word (FR-08), menu management and the pause switch through the API, the dashboard API, restaurant onboarding, and the dashboard's orders and order-details screens. In progress: the menu screen.</w:t>
             </w:r>
           </w:p>
         </w:tc>
@@ -4654,7 +4654,7 @@
                 <w:sz w:val="19"/>
                 <w:szCs w:val="19"/>
               </w:rPr>
-              <w:t xml:space="preserve">In progress. 810 automated tests run against a real PostgreSQL 16 (shared package 185 · dashboard 71 · conversation engine 215 · dashboard API 333 · database 6), and the tenant-isolation gate (15 assertions plus 4 negative controls) blocks merges in continuous integration. Each change is also tried on a real WhatsApp test number before it is merged.</w:t>
+              <w:t xml:space="preserve">In progress. 902 automated tests run against a real PostgreSQL 16 (shared package 213 · dashboard 71 · conversation engine 255 · dashboard API 357 · database 6), and the tenant-isolation gate (15 assertions plus 4 negative controls) blocks merges in continuous integration. Each change is also tried on a real WhatsApp test number before it is merged.</w:t>
             </w:r>
           </w:p>
         </w:tc>
@@ -8355,7 +8355,7 @@
           <w:sz w:val="21"/>
           <w:szCs w:val="21"/>
         </w:rPr>
-        <w:t xml:space="preserve">These requirements were developed through: (1) evaluation of over 15 candidate project directions; (2) two rounds of critical review of the resulting requirements and positioning; (3) a full technical architecture and database design pass, which surfaced requirements not visible during initial gathering; (4) explicit modeling of the order and conversation state machines, which surfaced edge-case requirements such as automatic refund triggering and idempotent webhook handling; (5) consultation with the program mentor followed by a competitive review, which produced FR-18 to FR-21 and the exclusion of two higher-risk candidate features; (6) a design-phase sequence-diagram review, which corrected three internal inconsistencies carried in version 1.0 (FR-10, FR-11, FR-13), reflected in version 1.1; and (7) an implementation-phase review conducted for version 1.2, in which the foundation was actually built and executed against PostgreSQL 16, and in which the market and competitive claims were re-verified. That seventh round produced the positioning correction in Section 1.2, the competitor update in Section 1.2.1, the removal of the Business Solution Provider dependency, the closure of previously open tooling choices, and the deployment-topology clarification in Section 1.9.3. An eighth round, the implementation review for version 1.3 (9 October 2026), compared every requirement with the code on the main branch: it reworded nine requirements to the behaviour as built, formalised FR-22 to FR-24, added FR-25 to FR-28, and gave every requirement an implementation status.</w:t>
+        <w:t xml:space="preserve">These requirements were developed through: (1) evaluation of over 15 candidate project directions; (2) two rounds of critical review of the resulting requirements and positioning; (3) a full technical architecture and database design pass, which surfaced requirements not visible during initial gathering; (4) explicit modeling of the order and conversation state machines, which surfaced edge-case requirements such as automatic refund triggering and idempotent webhook handling; (5) consultation with the program mentor followed by a competitive review, which produced FR-18 to FR-21 and the exclusion of two higher-risk candidate features; (6) a design-phase sequence-diagram review, which corrected three internal inconsistencies carried in version 1.0 (FR-10, FR-11, FR-13), reflected in version 1.1; and (7) an implementation-phase review conducted for version 1.2, in which the foundation was actually built and executed against PostgreSQL 16, and in which the market and competitive claims were re-verified. That seventh round produced the positioning correction in Section 1.2, the competitor update in Section 1.2.1, the removal of the Business Solution Provider dependency, the closure of previously open tooling choices, and the deployment-topology clarification in Section 1.9.3. An eighth round, the implementation review for version 1.3 (9–10 October 2026), compared every requirement with the code on the main branch: it reworded ten requirements to the behaviour as built, formalised FR-22 to FR-24, added FR-25 to FR-28, and gave every requirement an implementation status.</w:t>
       </w:r>
     </w:p>
     <w:p>
@@ -8434,7 +8434,7 @@
           <w:sz w:val="21"/>
           <w:szCs w:val="21"/>
         </w:rPr>
-        <w:t xml:space="preserve">Built: 10 · Partially built: 5 · In progress: 2 · Planned: 1 · Not built or deferred: 10 (of 28).</w:t>
+        <w:t xml:space="preserve">Built: 11 · Partially built: 5 · In progress: 2 · Planned: 0 · Not built or deferred: 10 (of 28).</w:t>
       </w:r>
     </w:p>
     <w:tbl>
@@ -8564,7 +8564,7 @@
                 <w:sz w:val="19"/>
                 <w:szCs w:val="19"/>
               </w:rPr>
-              <w:t xml:space="preserve">Status (9 October 2026)</w:t>
+              <w:t xml:space="preserve">Status (10 October 2026)</w:t>
             </w:r>
           </w:p>
         </w:tc>
@@ -9345,7 +9345,7 @@
                 <w:sz w:val="19"/>
                 <w:szCs w:val="19"/>
               </w:rPr>
-              <w:t xml:space="preserve">One-tap reorder</w:t>
+              <w:t xml:space="preserve">One-word reorder of the last order</w:t>
             </w:r>
           </w:p>
         </w:tc>
@@ -9392,11 +9392,11 @@
                 <w:rFonts w:ascii="Calibri" w:cs="Calibri" w:eastAsia="Calibri" w:hAnsi="Calibri"/>
                 <w:b/>
                 <w:bCs/>
-                <w:color w:val="35555F"/>
-                <w:sz w:val="19"/>
-                <w:szCs w:val="19"/>
-              </w:rPr>
-              <w:t xml:space="preserve">Planned</w:t>
+                <w:color w:val="24632F"/>
+                <w:sz w:val="19"/>
+                <w:szCs w:val="19"/>
+              </w:rPr>
+              <w:t xml:space="preserve">Built</w:t>
             </w:r>
           </w:p>
         </w:tc>
@@ -13056,7 +13056,7 @@
                 <w:sz w:val="19"/>
                 <w:szCs w:val="19"/>
               </w:rPr>
-              <w:t xml:space="preserve"> — Built: availability and price changes through the API (GET and PATCH /menu-items). In progress (brief J-A): adding, renaming, archiving and restoring items, enable-all, and the 4,096-character guard; the dashboard screen follows (brief J-B). Deferred: creating and editing categories from the dashboard, item images and descriptions.</w:t>
+              <w:t xml:space="preserve"> — Built and merged on 10 October 2026 (brief J-A): adding items, renaming and repricing, availability, enabling every unavailable item at once, archiving and restoring, and the 4,096-character guard, through the API (GET, POST and PATCH /menu-items; POST /menu-items/enable-all; GET /menu-categories), covered by the API's menu suites and tried on the test number. In progress (brief J-B): the dashboard screen. Deferred: creating and editing categories from the dashboard, item images and descriptions.</w:t>
             </w:r>
           </w:p>
         </w:tc>
@@ -15144,7 +15144,7 @@
                 <w:sz w:val="19"/>
                 <w:szCs w:val="19"/>
               </w:rPr>
-              <w:t xml:space="preserve">An active session silent for less than 60 minutes -&gt; the message continues at the session's current step. The restaurant is closed -&gt; the closing message, with the day's opening hours, and no session. Ordering is paused or no item is available -&gt; the paused reply and no session (FR-28, in progress).</w:t>
+              <w:t xml:space="preserve">An active session silent for less than 60 minutes -&gt; the message continues at the session's current step. The restaurant is closed -&gt; the closing message, with the day's opening hours, and no session. Ordering is paused or no item is available -&gt; the paused reply and no session (FR-28). A returning customer -&gt; the welcome also offers their last order (FR-08).</w:t>
             </w:r>
           </w:p>
         </w:tc>
@@ -17016,7 +17016,7 @@
           <w:sz w:val="22"/>
           <w:szCs w:val="22"/>
         </w:rPr>
-        <w:t xml:space="preserve">FR-08 — Conversational Ordering</w:t>
+        <w:t xml:space="preserve">FR-08 — Conversational Ordering   (reworded in v1.3)</w:t>
       </w:r>
     </w:p>
     <w:tbl>
@@ -17039,7 +17039,7 @@
         <w:tc>
           <w:tcPr>
             <w:tcW w:type="dxa" w:w="2200"/>
-            <w:shd w:fill="F2F2F0" w:color="auto" w:val="clear"/>
+            <w:shd w:fill="FFE6A8" w:color="auto" w:val="clear"/>
             <w:tcMar>
               <w:top w:type="dxa" w:w="70"/>
               <w:left w:type="dxa" w:w="100"/>
@@ -17066,6 +17066,7 @@
         <w:tc>
           <w:tcPr>
             <w:tcW w:type="dxa" w:w="7100"/>
+            <w:shd w:color="auto" w:val="clear" w:fill="FFE6A8"/>
             <w:tcMar>
               <w:top w:type="dxa" w:w="70"/>
               <w:left w:type="dxa" w:w="100"/>
@@ -17189,7 +17190,7 @@
                 <w:sz w:val="19"/>
                 <w:szCs w:val="19"/>
               </w:rPr>
-              <w:t xml:space="preserve">The system shall proactively suggest a returning customer's usual order at the start of a new session, and allow them to reorder it with a single confirmation, without repeating full menu browsing.</w:t>
+              <w:t xml:space="preserve">The system shall offer a returning customer, inside the first message of a new conversation, the last order of theirs that the restaurant accepted, at today's names and prices, and shall let the customer repeat it with one word.</w:t>
             </w:r>
           </w:p>
         </w:tc>
@@ -17295,7 +17296,7 @@
                 <w:sz w:val="19"/>
                 <w:szCs w:val="19"/>
               </w:rPr>
-              <w:t xml:space="preserve">Customer sends a first message and has at least one prior completed order at this restaurant (proactive); or the customer explicitly selects a "reorder" option (manual).</w:t>
+              <w:t xml:space="preserve">A returning customer starts a new conversation (FR-05).</w:t>
             </w:r>
           </w:p>
         </w:tc>
@@ -17348,7 +17349,7 @@
                 <w:sz w:val="19"/>
                 <w:szCs w:val="19"/>
               </w:rPr>
-              <w:t xml:space="preserve">At least one prior completed order exists for this customer at this restaurant.</w:t>
+              <w:t xml:space="preserve">The customer has an order the restaurant accepted (accepted, preparing, ready or completed), and no order other than a cancelled or expired one created in the last 3 hours.</w:t>
             </w:r>
           </w:p>
         </w:tc>
@@ -17401,7 +17402,7 @@
                 <w:sz w:val="19"/>
                 <w:szCs w:val="19"/>
               </w:rPr>
-              <w:t xml:space="preserve">Customer's confirmation or dismissal of the suggested order.</w:t>
+              <w:t xml:space="preserve">The customer's past orders at this restaurant; today's menu; the reply «‫نفسه‬» (or «‫نفسو‬», «‫نفس الطلب‬»).</w:t>
             </w:r>
           </w:p>
         </w:tc>
@@ -17454,7 +17455,7 @@
                 <w:sz w:val="19"/>
                 <w:szCs w:val="19"/>
               </w:rPr>
-              <w:t xml:space="preserve">The system identifies the customer's most recent (or most frequent) order -&gt; proactively offers it in the welcome message -&gt; re-validates price / availability of every item -&gt; on confirmation, pre-fills conversation_sessions.context with the same items -&gt; the session jumps directly to "cart_review".</w:t>
+              <w:t xml:space="preserve">The engine reads the customer's last accepted order and checks each item against today's menu -&gt; the welcome carries the block «‫آخر طلب لك:‬» with the available items at today's prices and their total, and the line «‫اكتب «نفسه‬» لتكرار الطلب.» (type «‫نفسه‬» to repeat the order), above the full menu -&gt; the customer replies «‫نفسه‬» -&gt; the cart is filled from the suggestion, with availability and prices read again at that moment -&gt; the conversation continues exactly as after «‫تم‬»: pickup or delivery (FR-09), then the summary (FR-07).</w:t>
             </w:r>
           </w:p>
         </w:tc>
@@ -17507,7 +17508,7 @@
                 <w:sz w:val="19"/>
                 <w:szCs w:val="19"/>
               </w:rPr>
-              <w:t xml:space="preserve">Customer dismisses the suggestion and browses normally; or confirms but then modifies the pre-filled cart before final confirmation.</w:t>
+              <w:t xml:space="preserve">The customer orders by number instead -&gt; the suggestion is ignored; «‫نفسه‬» applies only to an empty cart and is otherwise read as ordinary text. After «‫نفسه‬», «‫عدّل‬» at the summary returns to browsing with the cart kept, so items can be added or removed.</w:t>
             </w:r>
           </w:p>
         </w:tc>
@@ -17560,7 +17561,7 @@
                 <w:sz w:val="19"/>
                 <w:szCs w:val="19"/>
               </w:rPr>
-              <w:t xml:space="preserve">One or more items from the prior order are no longer available -&gt; the system flags the specific item(s) and asks the customer to substitute or remove them before proceeding.</w:t>
+              <w:t xml:space="preserve">Items unavailable today -&gt; left out of the suggestion and named in one line («‫غير متوفر الآن‬»). No item available -&gt; no suggestion. The welcome with the block would exceed 4,096 characters -&gt; it is sent without the block, and logged. An item switched off between the welcome and «‫نفسه‬» -&gt; named in the reply and left out of the cart.</w:t>
             </w:r>
           </w:p>
         </w:tc>
@@ -17613,7 +17614,7 @@
                 <w:sz w:val="19"/>
                 <w:szCs w:val="19"/>
               </w:rPr>
-              <w:t xml:space="preserve">Session in state "cart_review" with a pre-filled, validated cart.</w:t>
+              <w:t xml:space="preserve">The suggestion is kept in the session (context.reorder); no order is written until the customer confirms (FR-07).</w:t>
             </w:r>
           </w:p>
         </w:tc>
@@ -17771,19 +17772,19 @@
                 <w:rFonts w:ascii="Calibri" w:cs="Calibri" w:eastAsia="Calibri" w:hAnsi="Calibri"/>
                 <w:b/>
                 <w:bCs/>
-                <w:color w:val="35555F"/>
-                <w:sz w:val="19"/>
-                <w:szCs w:val="19"/>
-              </w:rPr>
-              <w:t xml:space="preserve">Planned</w:t>
-            </w:r>
-            <w:r>
-              <w:rPr>
-                <w:rFonts w:ascii="Calibri" w:cs="Calibri" w:eastAsia="Calibri" w:hAnsi="Calibri"/>
-                <w:sz w:val="19"/>
-                <w:szCs w:val="19"/>
-              </w:rPr>
-              <w:t xml:space="preserve"> — Next after menu management (decision of 9 October 2026). Not built: no code reads past orders for a suggestion yet. Prepared since August: the index idx_orders_customer_completed, and order_items.menu_item_id, which maps a past order back to today's menu. To settle before its brief: whether 'usual' means the most recent or the most frequent order, and the exact customer-facing text.</w:t>
+                <w:color w:val="24632F"/>
+                <w:sz w:val="19"/>
+                <w:szCs w:val="19"/>
+              </w:rPr>
+              <w:t xml:space="preserve">Built</w:t>
+            </w:r>
+            <w:r>
+              <w:rPr>
+                <w:rFonts w:ascii="Calibri" w:cs="Calibri" w:eastAsia="Calibri" w:hAnsi="Calibri"/>
+                <w:sz w:val="19"/>
+                <w:szCs w:val="19"/>
+              </w:rPr>
+              <w:t xml:space="preserve"> — Built and merged on 10 October 2026 (brief K), with migration 0015 (idx_orders_customer_recent), covered by the engine's reorder suite and tried on a real WhatsApp number: delivery, a cancelled order skipped, an archived item named. 'Usual' means the last accepted order, not the most frequent one (decision of 10 October 2026); the 3-hour window is configurable (REORDER_MIN_AGE_MINUTES). The 30-second target of NFR-03 is not measured yet.</w:t>
             </w:r>
           </w:p>
         </w:tc>
@@ -19189,7 +19190,7 @@
                 <w:sz w:val="19"/>
                 <w:szCs w:val="19"/>
               </w:rPr>
-              <w:t xml:space="preserve">An order record exists with a defined payment_method and payment_status, created at the time of method selection.</w:t>
+              <w:t xml:space="preserve">Cash: the order exists from the customer's confirmation, with payment_status pending_cash, which becomes collected when the order is completed. Online (deferred): the order exists from method selection, with payment_status pending_online. In neither case is the order created on payment confirmation.</w:t>
             </w:r>
           </w:p>
         </w:tc>
@@ -33536,7 +33537,7 @@
                 <w:sz w:val="19"/>
                 <w:szCs w:val="19"/>
               </w:rPr>
-              <w:t xml:space="preserve"> — Brief J-A, together with menu management. While ordering is paused, every dashboard screen shows a banner with a resume action (decision of 9 October 2026).</w:t>
+              <w:t xml:space="preserve"> — Built and merged on 10 October 2026 (brief J-A): restaurants.orders_paused_at, the engine's paused reply at every step, and the API (PATCH /restaurant/orders-pause), tried on the test number. In progress (brief J-B): the dashboard button, and a banner on every dashboard screen with a resume action (decision of 9 October 2026).</w:t>
             </w:r>
           </w:p>
         </w:tc>
@@ -33723,7 +33724,7 @@
           <w:sz w:val="21"/>
           <w:szCs w:val="21"/>
         </w:rPr>
-        <w:t xml:space="preserve">Happy Path — Proactive One-Tap Reorder (FR-08) — planned</w:t>
+        <w:t xml:space="preserve">Happy Path — Repeating the Last Order in One Word (FR-08) — built</w:t>
       </w:r>
     </w:p>
     <w:p>
@@ -33736,7 +33737,7 @@
           <w:sz w:val="21"/>
           <w:szCs w:val="21"/>
         </w:rPr>
-        <w:t xml:space="preserve">Customer sends a first message -&gt; the system recognises a prior completed order and proactively suggests it in the welcome message -&gt; customer confirms -&gt; the system re-validates prices and availability -&gt; pre-fills the cart -&gt; re-validates once more at cart confirmation -&gt; the order is created -&gt; a confirmation is sent.</w:t>
+        <w:t xml:space="preserve">Customer sends a first message -&gt; the system finds the last order of theirs that the restaurant accepted (none if an order of theirs is under 3 hours old) and shows it in the welcome, at today's names and prices -&gt; the customer replies «‫نفسه‬» -&gt; the cart is filled, availability and prices read again -&gt; pickup or delivery and the summary follow as after «‫تم‬» -&gt; the customer confirms -&gt; availability is re-checked once more -&gt; the order is created -&gt; «‫استلمنا طلبك رقم …‬» is sent after the commit.</w:t>
       </w:r>
     </w:p>
     <w:p>
@@ -33751,7 +33752,7 @@
           <w:sz w:val="21"/>
           <w:szCs w:val="21"/>
         </w:rPr>
-        <w:t xml:space="preserve">Alternative Flow — Reorder with Modification — planned</w:t>
+        <w:t xml:space="preserve">Alternative Flow — Reorder with Modification — built</w:t>
       </w:r>
     </w:p>
     <w:p>
@@ -33764,7 +33765,7 @@
           <w:sz w:val="21"/>
           <w:szCs w:val="21"/>
         </w:rPr>
-        <w:t xml:space="preserve">Customer selects reorder -&gt; the cart is pre-filled -&gt; customer adds or removes an item -&gt; the system returns to the browsing flow with the pre-filled cart retained -&gt; customer confirms the modified cart -&gt; the order proceeds as normal.</w:t>
+        <w:t xml:space="preserve">Customer replies «‫نفسه‬» -&gt; the cart is filled -&gt; at the summary, «‫عدّل‬» returns to browsing with the cart and the fulfilment choice kept -&gt; the customer adds or removes items by number -&gt; «‫تم‬» -&gt; the order proceeds as normal.</w:t>
       </w:r>
     </w:p>
     <w:p>
@@ -33779,7 +33780,7 @@
           <w:sz w:val="21"/>
           <w:szCs w:val="21"/>
         </w:rPr>
-        <w:t xml:space="preserve">Exception Flow — Reorder with an Unavailable Item — planned</w:t>
+        <w:t xml:space="preserve">Exception Flow — Reorder with an Unavailable Item — built</w:t>
       </w:r>
     </w:p>
     <w:p>
@@ -33792,7 +33793,7 @@
           <w:sz w:val="21"/>
           <w:szCs w:val="21"/>
         </w:rPr>
-        <w:t xml:space="preserve">Customer selects reorder -&gt; one or more previously ordered items are no longer available -&gt; the system flags the specific item(s) -&gt; the customer is asked to substitute or remove them -&gt; the order proceeds once the cart is valid.</w:t>
+        <w:t xml:space="preserve">One or more items of the last order are unavailable today -&gt; the suggestion leaves them out and names them in one line; with none available, no suggestion is shown. An item switched off between the welcome and «‫نفسه‬» is named in the reply and left out of the cart. No substitute is proposed: the customer adds another item by number.</w:t>
       </w:r>
     </w:p>
     <w:p>
@@ -34514,7 +34515,7 @@
           <w:sz w:val="21"/>
           <w:szCs w:val="21"/>
         </w:rPr>
-        <w:t xml:space="preserve">A returning customer shall complete a reorder within 30 seconds during usability testing (depends on FR-08, planned).</w:t>
+        <w:t xml:space="preserve">A returning customer shall complete a reorder within 30 seconds during usability testing (FR-08 built on 10 October 2026; not measured yet).</w:t>
       </w:r>
     </w:p>
     <w:p>

</xml_diff>